<commit_message>
Commit the work of the Map, PI, PID, SMC frames and the paper draft
Snapshot before the models are reformatted to use MATLAB Function blocks.
- Model/: controllers Map, PI, PID, SMC, ISMC with their scripts; common/ and Sim/ updates (3-panel run_cases figure, RAMP case, pick_by_balance)
- Documents/Paper/: paper.txt (sections 1-7), docx and pdf, resource package and README
- Result/: calibration sweeps, picks and scoring cases of each controller; old TestCases folders removed (renamed to Cases)
- Figures/, tools/: paper figures 1-17 and the scripts that make them
- Tracking/: frame logs (Map, Linear, SMC, COMMON)

Co-Authored-By: Claude Haiku 5.5 <noreply@anthropic.com>
</commit_message>
<xml_diff>
--- a/Documents/Thesis/dan_y_bai_bao.docx
+++ b/Documents/Thesis/dan_y_bai_bao.docx
@@ -153,7 +153,7 @@
         <w:pStyle w:val="ListBullet"/>
       </w:pPr>
       <w:r>
-        <w:t>Ca TK và TC1-TC6; chỉ tiêu R, S, TV, e_rel, trợ lực thừa; cổng đặt trước (ổn định, PM &gt;= 45, GM &gt;= 2, không bang-bang, e_rel &lt;= 3 %); quy tắc chọn (R trong 5 % rồi S nhỏ nhất); seed local và seed chung 99999.</w:t>
+        <w:t>Ca CALIB và năm ca DREWS; chỉ tiêu R, S, TV, e_rel, trợ lực thừa; cổng đặt trước (ổn định có độ dư đo bằng mô phỏng, e_rel &lt;= 5 %); quy tắc chọn J = R x S kèm ràng buộc dải lái (độ lợi &gt;= 0.707 tại 2 Hz); seed local và seed chung 99999.</w:t>
       </w:r>
     </w:p>
     <w:p>
@@ -169,7 +169,7 @@
         <w:pStyle w:val="ListBullet"/>
       </w:pPr>
       <w:r>
-        <w:t>Map: bản đồ M(v, |T_s|) + lead (z = 59.8, p = 1666 rad/s), K_max = 6.75, một tham số chỉnh.</w:t>
+        <w:t>Map: bản đồ M(v, |T_s|) + lead (z = 33.5, p = 600 rad/s) nhân lag (z1 = 28.1, p1 = 10.7 rad/s), K_max = 6, hai tham số chỉnh bằng mô phỏng (K và g_min).</w:t>
       </w:r>
     </w:p>
     <w:p>
@@ -177,7 +177,7 @@
         <w:pStyle w:val="ListBullet"/>
       </w:pPr>
       <w:r>
-        <w:t>PI: Kp = 1.25, Ki = 3 1/s (hai tham số chỉnh).</w:t>
+        <w:t>PI: Kp = 1.08, Ki = 14.4 1/s (hai tham số chỉnh).</w:t>
       </w:r>
     </w:p>
     <w:p>
@@ -255,42 +255,8 @@
       </w:r>
     </w:p>
     <w:p>
-      <w:pPr>
-        <w:jc w:val="center"/>
-      </w:pPr>
       <w:r>
-        <w:drawing>
-          <wp:inline xmlns:a="http://schemas.openxmlformats.org/drawingml/2006/main" xmlns:pic="http://schemas.openxmlformats.org/drawingml/2006/picture">
-            <wp:extent cx="4320000" cy="3051325"/>
-            <wp:docPr id="3" name="Picture 3"/>
-            <wp:cNvGraphicFramePr>
-              <a:graphicFrameLocks noChangeAspect="1"/>
-            </wp:cNvGraphicFramePr>
-            <a:graphic>
-              <a:graphicData uri="http://schemas.openxmlformats.org/drawingml/2006/picture">
-                <pic:pic>
-                  <pic:nvPicPr>
-                    <pic:cNvPr id="0" name="PI_pareto_coarse.png"/>
-                    <pic:cNvPicPr/>
-                  </pic:nvPicPr>
-                  <pic:blipFill>
-                    <a:blip r:embed="rId11"/>
-                    <a:stretch>
-                      <a:fillRect/>
-                    </a:stretch>
-                  </pic:blipFill>
-                  <pic:spPr>
-                    <a:xfrm>
-                      <a:off x="0" y="0"/>
-                      <a:ext cx="4320000" cy="3051325"/>
-                    </a:xfrm>
-                    <a:prstGeom prst="rect"/>
-                  </pic:spPr>
-                </pic:pic>
-              </a:graphicData>
-            </a:graphic>
-          </wp:inline>
-        </w:drawing>
+        <w:t>[khung hình trống: không thấy Result/Controllers/PI/Sweep/PI_pareto_coarse.png]</w:t>
       </w:r>
     </w:p>
     <w:p>
@@ -311,8 +277,8 @@
       <w:r>
         <w:drawing>
           <wp:inline xmlns:a="http://schemas.openxmlformats.org/drawingml/2006/main" xmlns:pic="http://schemas.openxmlformats.org/drawingml/2006/picture">
-            <wp:extent cx="4320000" cy="3586600"/>
-            <wp:docPr id="4" name="Picture 4"/>
+            <wp:extent cx="4320000" cy="2918919"/>
+            <wp:docPr id="3" name="Picture 3"/>
             <wp:cNvGraphicFramePr>
               <a:graphicFrameLocks noChangeAspect="1"/>
             </wp:cNvGraphicFramePr>
@@ -320,11 +286,11 @@
               <a:graphicData uri="http://schemas.openxmlformats.org/drawingml/2006/picture">
                 <pic:pic>
                   <pic:nvPicPr>
-                    <pic:cNvPr id="0" name="Map_step5_pareto_TK.png"/>
+                    <pic:cNvPr id="0" name="Map_CALIB_pareto_s00000.png"/>
                     <pic:cNvPicPr/>
                   </pic:nvPicPr>
                   <pic:blipFill>
-                    <a:blip r:embed="rId12"/>
+                    <a:blip r:embed="rId11"/>
                     <a:stretch>
                       <a:fillRect/>
                     </a:stretch>
@@ -332,7 +298,7 @@
                   <pic:spPr>
                     <a:xfrm>
                       <a:off x="0" y="0"/>
-                      <a:ext cx="4320000" cy="3586600"/>
+                      <a:ext cx="4320000" cy="2918919"/>
                     </a:xfrm>
                     <a:prstGeom prst="rect"/>
                   </pic:spPr>
@@ -351,7 +317,7 @@
         <w:rPr>
           <w:i/>
         </w:rPr>
-        <w:t>Hình 4: Mặt Pareto của Map (quét K)</w:t>
+        <w:t>Hình 4: Mặt (R, S) của Map (73 cặp g_min, K)</w:t>
       </w:r>
     </w:p>
     <w:p>
@@ -359,1037 +325,7 @@
         <w:rPr>
           <w:i/>
         </w:rPr>
-        <w:t>[Chưa có] Pareto chung Map, PI, PID cùng trục (cần PID và chọn lại theo cùng ca TK).</w:t>
-      </w:r>
-    </w:p>
-    <w:p>
-      <w:r>
-        <w:rPr>
-          <w:i/>
-        </w:rPr>
-        <w:t>Bảng 1: RMS e_T cả ca (N.m), seed 99999</w:t>
-      </w:r>
-    </w:p>
-    <w:tbl>
-      <w:tblPr>
-        <w:tblStyle w:val="TableGrid"/>
-        <w:tblW w:type="auto" w:w="0"/>
-        <w:tblLook w:firstColumn="1" w:firstRow="1" w:lastColumn="0" w:lastRow="0" w:noHBand="0" w:noVBand="1" w:val="04A0"/>
-      </w:tblPr>
-      <w:tblGrid>
-        <w:gridCol w:w="3135"/>
-        <w:gridCol w:w="3135"/>
-        <w:gridCol w:w="3135"/>
-      </w:tblGrid>
-      <w:tr>
-        <w:tc>
-          <w:tcPr>
-            <w:tcW w:type="dxa" w:w="3135"/>
-          </w:tcPr>
-          <w:p>
-            <w:r>
-              <w:rPr>
-                <w:b/>
-                <w:sz w:val="20"/>
-              </w:rPr>
-              <w:t>Ca</w:t>
-            </w:r>
-          </w:p>
-        </w:tc>
-        <w:tc>
-          <w:tcPr>
-            <w:tcW w:type="dxa" w:w="3135"/>
-          </w:tcPr>
-          <w:p>
-            <w:r>
-              <w:rPr>
-                <w:b/>
-                <w:sz w:val="20"/>
-              </w:rPr>
-              <w:t>Map</w:t>
-            </w:r>
-          </w:p>
-        </w:tc>
-        <w:tc>
-          <w:tcPr>
-            <w:tcW w:type="dxa" w:w="3135"/>
-          </w:tcPr>
-          <w:p>
-            <w:r>
-              <w:rPr>
-                <w:b/>
-                <w:sz w:val="20"/>
-              </w:rPr>
-              <w:t>PI</w:t>
-            </w:r>
-          </w:p>
-        </w:tc>
-      </w:tr>
-      <w:tr>
-        <w:tc>
-          <w:tcPr>
-            <w:tcW w:type="dxa" w:w="3135"/>
-          </w:tcPr>
-          <w:p>
-            <w:r>
-              <w:rPr>
-                <w:sz w:val="20"/>
-              </w:rPr>
-              <w:t>TC1</w:t>
-            </w:r>
-          </w:p>
-        </w:tc>
-        <w:tc>
-          <w:tcPr>
-            <w:tcW w:type="dxa" w:w="3135"/>
-          </w:tcPr>
-          <w:p>
-            <w:r>
-              <w:rPr>
-                <w:sz w:val="20"/>
-              </w:rPr>
-              <w:t>0.644</w:t>
-            </w:r>
-          </w:p>
-        </w:tc>
-        <w:tc>
-          <w:tcPr>
-            <w:tcW w:type="dxa" w:w="3135"/>
-          </w:tcPr>
-          <w:p>
-            <w:r>
-              <w:rPr>
-                <w:sz w:val="20"/>
-              </w:rPr>
-              <w:t>0.485</w:t>
-            </w:r>
-          </w:p>
-        </w:tc>
-      </w:tr>
-      <w:tr>
-        <w:tc>
-          <w:tcPr>
-            <w:tcW w:type="dxa" w:w="3135"/>
-          </w:tcPr>
-          <w:p>
-            <w:r>
-              <w:rPr>
-                <w:sz w:val="20"/>
-              </w:rPr>
-              <w:t>TC2</w:t>
-            </w:r>
-          </w:p>
-        </w:tc>
-        <w:tc>
-          <w:tcPr>
-            <w:tcW w:type="dxa" w:w="3135"/>
-          </w:tcPr>
-          <w:p>
-            <w:r>
-              <w:rPr>
-                <w:sz w:val="20"/>
-              </w:rPr>
-              <w:t>0.837</w:t>
-            </w:r>
-          </w:p>
-        </w:tc>
-        <w:tc>
-          <w:tcPr>
-            <w:tcW w:type="dxa" w:w="3135"/>
-          </w:tcPr>
-          <w:p>
-            <w:r>
-              <w:rPr>
-                <w:sz w:val="20"/>
-              </w:rPr>
-              <w:t>0.564</w:t>
-            </w:r>
-          </w:p>
-        </w:tc>
-      </w:tr>
-      <w:tr>
-        <w:tc>
-          <w:tcPr>
-            <w:tcW w:type="dxa" w:w="3135"/>
-          </w:tcPr>
-          <w:p>
-            <w:r>
-              <w:rPr>
-                <w:sz w:val="20"/>
-              </w:rPr>
-              <w:t>TC3</w:t>
-            </w:r>
-          </w:p>
-        </w:tc>
-        <w:tc>
-          <w:tcPr>
-            <w:tcW w:type="dxa" w:w="3135"/>
-          </w:tcPr>
-          <w:p>
-            <w:r>
-              <w:rPr>
-                <w:sz w:val="20"/>
-              </w:rPr>
-              <w:t>0.484</w:t>
-            </w:r>
-          </w:p>
-        </w:tc>
-        <w:tc>
-          <w:tcPr>
-            <w:tcW w:type="dxa" w:w="3135"/>
-          </w:tcPr>
-          <w:p>
-            <w:r>
-              <w:rPr>
-                <w:sz w:val="20"/>
-              </w:rPr>
-              <w:t>0.25</w:t>
-            </w:r>
-          </w:p>
-        </w:tc>
-      </w:tr>
-      <w:tr>
-        <w:tc>
-          <w:tcPr>
-            <w:tcW w:type="dxa" w:w="3135"/>
-          </w:tcPr>
-          <w:p>
-            <w:r>
-              <w:rPr>
-                <w:sz w:val="20"/>
-              </w:rPr>
-              <w:t>TC4</w:t>
-            </w:r>
-          </w:p>
-        </w:tc>
-        <w:tc>
-          <w:tcPr>
-            <w:tcW w:type="dxa" w:w="3135"/>
-          </w:tcPr>
-          <w:p>
-            <w:r>
-              <w:rPr>
-                <w:sz w:val="20"/>
-              </w:rPr>
-              <w:t>0.866</w:t>
-            </w:r>
-          </w:p>
-        </w:tc>
-        <w:tc>
-          <w:tcPr>
-            <w:tcW w:type="dxa" w:w="3135"/>
-          </w:tcPr>
-          <w:p>
-            <w:r>
-              <w:rPr>
-                <w:sz w:val="20"/>
-              </w:rPr>
-              <w:t>0.621</w:t>
-            </w:r>
-          </w:p>
-        </w:tc>
-      </w:tr>
-      <w:tr>
-        <w:tc>
-          <w:tcPr>
-            <w:tcW w:type="dxa" w:w="3135"/>
-          </w:tcPr>
-          <w:p>
-            <w:r>
-              <w:rPr>
-                <w:sz w:val="20"/>
-              </w:rPr>
-              <w:t>TC5</w:t>
-            </w:r>
-          </w:p>
-        </w:tc>
-        <w:tc>
-          <w:tcPr>
-            <w:tcW w:type="dxa" w:w="3135"/>
-          </w:tcPr>
-          <w:p>
-            <w:r>
-              <w:rPr>
-                <w:sz w:val="20"/>
-              </w:rPr>
-              <w:t>1.71</w:t>
-            </w:r>
-          </w:p>
-        </w:tc>
-        <w:tc>
-          <w:tcPr>
-            <w:tcW w:type="dxa" w:w="3135"/>
-          </w:tcPr>
-          <w:p>
-            <w:r>
-              <w:rPr>
-                <w:sz w:val="20"/>
-              </w:rPr>
-              <w:t>0.805</w:t>
-            </w:r>
-          </w:p>
-        </w:tc>
-      </w:tr>
-      <w:tr>
-        <w:tc>
-          <w:tcPr>
-            <w:tcW w:type="dxa" w:w="3135"/>
-          </w:tcPr>
-          <w:p>
-            <w:r>
-              <w:rPr>
-                <w:sz w:val="20"/>
-              </w:rPr>
-              <w:t>TC6</w:t>
-            </w:r>
-          </w:p>
-        </w:tc>
-        <w:tc>
-          <w:tcPr>
-            <w:tcW w:type="dxa" w:w="3135"/>
-          </w:tcPr>
-          <w:p>
-            <w:r>
-              <w:rPr>
-                <w:sz w:val="20"/>
-              </w:rPr>
-              <w:t>0.0149</w:t>
-            </w:r>
-          </w:p>
-        </w:tc>
-        <w:tc>
-          <w:tcPr>
-            <w:tcW w:type="dxa" w:w="3135"/>
-          </w:tcPr>
-          <w:p>
-            <w:r>
-              <w:rPr>
-                <w:sz w:val="20"/>
-              </w:rPr>
-              <w:t>0.0661</w:t>
-            </w:r>
-          </w:p>
-        </w:tc>
-      </w:tr>
-    </w:tbl>
-    <w:p/>
-    <w:p>
-      <w:r>
-        <w:rPr>
-          <w:i/>
-        </w:rPr>
-        <w:t>Bảng 2: TV của T_a cả ca (N.m/s), seed 99999</w:t>
-      </w:r>
-    </w:p>
-    <w:tbl>
-      <w:tblPr>
-        <w:tblStyle w:val="TableGrid"/>
-        <w:tblW w:type="auto" w:w="0"/>
-        <w:tblLook w:firstColumn="1" w:firstRow="1" w:lastColumn="0" w:lastRow="0" w:noHBand="0" w:noVBand="1" w:val="04A0"/>
-      </w:tblPr>
-      <w:tblGrid>
-        <w:gridCol w:w="3135"/>
-        <w:gridCol w:w="3135"/>
-        <w:gridCol w:w="3135"/>
-      </w:tblGrid>
-      <w:tr>
-        <w:tc>
-          <w:tcPr>
-            <w:tcW w:type="dxa" w:w="3135"/>
-          </w:tcPr>
-          <w:p>
-            <w:r>
-              <w:rPr>
-                <w:b/>
-                <w:sz w:val="20"/>
-              </w:rPr>
-              <w:t>Ca</w:t>
-            </w:r>
-          </w:p>
-        </w:tc>
-        <w:tc>
-          <w:tcPr>
-            <w:tcW w:type="dxa" w:w="3135"/>
-          </w:tcPr>
-          <w:p>
-            <w:r>
-              <w:rPr>
-                <w:b/>
-                <w:sz w:val="20"/>
-              </w:rPr>
-              <w:t>Map</w:t>
-            </w:r>
-          </w:p>
-        </w:tc>
-        <w:tc>
-          <w:tcPr>
-            <w:tcW w:type="dxa" w:w="3135"/>
-          </w:tcPr>
-          <w:p>
-            <w:r>
-              <w:rPr>
-                <w:b/>
-                <w:sz w:val="20"/>
-              </w:rPr>
-              <w:t>PI</w:t>
-            </w:r>
-          </w:p>
-        </w:tc>
-      </w:tr>
-      <w:tr>
-        <w:tc>
-          <w:tcPr>
-            <w:tcW w:type="dxa" w:w="3135"/>
-          </w:tcPr>
-          <w:p>
-            <w:r>
-              <w:rPr>
-                <w:sz w:val="20"/>
-              </w:rPr>
-              <w:t>TC1</w:t>
-            </w:r>
-          </w:p>
-        </w:tc>
-        <w:tc>
-          <w:tcPr>
-            <w:tcW w:type="dxa" w:w="3135"/>
-          </w:tcPr>
-          <w:p>
-            <w:r>
-              <w:rPr>
-                <w:sz w:val="20"/>
-              </w:rPr>
-              <w:t>325</w:t>
-            </w:r>
-          </w:p>
-        </w:tc>
-        <w:tc>
-          <w:tcPr>
-            <w:tcW w:type="dxa" w:w="3135"/>
-          </w:tcPr>
-          <w:p>
-            <w:r>
-              <w:rPr>
-                <w:sz w:val="20"/>
-              </w:rPr>
-              <w:t>19.3</w:t>
-            </w:r>
-          </w:p>
-        </w:tc>
-      </w:tr>
-      <w:tr>
-        <w:tc>
-          <w:tcPr>
-            <w:tcW w:type="dxa" w:w="3135"/>
-          </w:tcPr>
-          <w:p>
-            <w:r>
-              <w:rPr>
-                <w:sz w:val="20"/>
-              </w:rPr>
-              <w:t>TC2</w:t>
-            </w:r>
-          </w:p>
-        </w:tc>
-        <w:tc>
-          <w:tcPr>
-            <w:tcW w:type="dxa" w:w="3135"/>
-          </w:tcPr>
-          <w:p>
-            <w:r>
-              <w:rPr>
-                <w:sz w:val="20"/>
-              </w:rPr>
-              <w:t>292</w:t>
-            </w:r>
-          </w:p>
-        </w:tc>
-        <w:tc>
-          <w:tcPr>
-            <w:tcW w:type="dxa" w:w="3135"/>
-          </w:tcPr>
-          <w:p>
-            <w:r>
-              <w:rPr>
-                <w:sz w:val="20"/>
-              </w:rPr>
-              <w:t>28.2</w:t>
-            </w:r>
-          </w:p>
-        </w:tc>
-      </w:tr>
-      <w:tr>
-        <w:tc>
-          <w:tcPr>
-            <w:tcW w:type="dxa" w:w="3135"/>
-          </w:tcPr>
-          <w:p>
-            <w:r>
-              <w:rPr>
-                <w:sz w:val="20"/>
-              </w:rPr>
-              <w:t>TC3</w:t>
-            </w:r>
-          </w:p>
-        </w:tc>
-        <w:tc>
-          <w:tcPr>
-            <w:tcW w:type="dxa" w:w="3135"/>
-          </w:tcPr>
-          <w:p>
-            <w:r>
-              <w:rPr>
-                <w:sz w:val="20"/>
-              </w:rPr>
-              <w:t>477</w:t>
-            </w:r>
-          </w:p>
-        </w:tc>
-        <w:tc>
-          <w:tcPr>
-            <w:tcW w:type="dxa" w:w="3135"/>
-          </w:tcPr>
-          <w:p>
-            <w:r>
-              <w:rPr>
-                <w:sz w:val="20"/>
-              </w:rPr>
-              <w:t>7.36</w:t>
-            </w:r>
-          </w:p>
-        </w:tc>
-      </w:tr>
-      <w:tr>
-        <w:tc>
-          <w:tcPr>
-            <w:tcW w:type="dxa" w:w="3135"/>
-          </w:tcPr>
-          <w:p>
-            <w:r>
-              <w:rPr>
-                <w:sz w:val="20"/>
-              </w:rPr>
-              <w:t>TC4</w:t>
-            </w:r>
-          </w:p>
-        </w:tc>
-        <w:tc>
-          <w:tcPr>
-            <w:tcW w:type="dxa" w:w="3135"/>
-          </w:tcPr>
-          <w:p>
-            <w:r>
-              <w:rPr>
-                <w:sz w:val="20"/>
-              </w:rPr>
-              <w:t>87.0</w:t>
-            </w:r>
-          </w:p>
-        </w:tc>
-        <w:tc>
-          <w:tcPr>
-            <w:tcW w:type="dxa" w:w="3135"/>
-          </w:tcPr>
-          <w:p>
-            <w:r>
-              <w:rPr>
-                <w:sz w:val="20"/>
-              </w:rPr>
-              <w:t>40.9</w:t>
-            </w:r>
-          </w:p>
-        </w:tc>
-      </w:tr>
-      <w:tr>
-        <w:tc>
-          <w:tcPr>
-            <w:tcW w:type="dxa" w:w="3135"/>
-          </w:tcPr>
-          <w:p>
-            <w:r>
-              <w:rPr>
-                <w:sz w:val="20"/>
-              </w:rPr>
-              <w:t>TC5</w:t>
-            </w:r>
-          </w:p>
-        </w:tc>
-        <w:tc>
-          <w:tcPr>
-            <w:tcW w:type="dxa" w:w="3135"/>
-          </w:tcPr>
-          <w:p>
-            <w:r>
-              <w:rPr>
-                <w:sz w:val="20"/>
-              </w:rPr>
-              <w:t>243</w:t>
-            </w:r>
-          </w:p>
-        </w:tc>
-        <w:tc>
-          <w:tcPr>
-            <w:tcW w:type="dxa" w:w="3135"/>
-          </w:tcPr>
-          <w:p>
-            <w:r>
-              <w:rPr>
-                <w:sz w:val="20"/>
-              </w:rPr>
-              <w:t>29.8</w:t>
-            </w:r>
-          </w:p>
-        </w:tc>
-      </w:tr>
-      <w:tr>
-        <w:tc>
-          <w:tcPr>
-            <w:tcW w:type="dxa" w:w="3135"/>
-          </w:tcPr>
-          <w:p>
-            <w:r>
-              <w:rPr>
-                <w:sz w:val="20"/>
-              </w:rPr>
-              <w:t>TC6</w:t>
-            </w:r>
-          </w:p>
-        </w:tc>
-        <w:tc>
-          <w:tcPr>
-            <w:tcW w:type="dxa" w:w="3135"/>
-          </w:tcPr>
-          <w:p>
-            <w:r>
-              <w:rPr>
-                <w:sz w:val="20"/>
-              </w:rPr>
-              <w:t>695</w:t>
-            </w:r>
-          </w:p>
-        </w:tc>
-        <w:tc>
-          <w:tcPr>
-            <w:tcW w:type="dxa" w:w="3135"/>
-          </w:tcPr>
-          <w:p>
-            <w:r>
-              <w:rPr>
-                <w:sz w:val="20"/>
-              </w:rPr>
-              <w:t>7.66</w:t>
-            </w:r>
-          </w:p>
-        </w:tc>
-      </w:tr>
-    </w:tbl>
-    <w:p/>
-    <w:p>
-      <w:pPr>
-        <w:jc w:val="center"/>
-      </w:pPr>
-      <w:r>
-        <w:drawing>
-          <wp:inline xmlns:a="http://schemas.openxmlformats.org/drawingml/2006/main" xmlns:pic="http://schemas.openxmlformats.org/drawingml/2006/picture">
-            <wp:extent cx="5040000" cy="3915912"/>
-            <wp:docPr id="5" name="Picture 5"/>
-            <wp:cNvGraphicFramePr>
-              <a:graphicFrameLocks noChangeAspect="1"/>
-            </wp:cNvGraphicFramePr>
-            <a:graphic>
-              <a:graphicData uri="http://schemas.openxmlformats.org/drawingml/2006/picture">
-                <pic:pic>
-                  <pic:nvPicPr>
-                    <pic:cNvPr id="0" name="Map_vs_PI_whole_case.png"/>
-                    <pic:cNvPicPr/>
-                  </pic:nvPicPr>
-                  <pic:blipFill>
-                    <a:blip r:embed="rId13"/>
-                    <a:stretch>
-                      <a:fillRect/>
-                    </a:stretch>
-                  </pic:blipFill>
-                  <pic:spPr>
-                    <a:xfrm>
-                      <a:off x="0" y="0"/>
-                      <a:ext cx="5040000" cy="3915912"/>
-                    </a:xfrm>
-                    <a:prstGeom prst="rect"/>
-                  </pic:spPr>
-                </pic:pic>
-              </a:graphicData>
-            </a:graphic>
-          </wp:inline>
-        </w:drawing>
-      </w:r>
-    </w:p>
-    <w:p>
-      <w:pPr>
-        <w:jc w:val="center"/>
-      </w:pPr>
-      <w:r>
-        <w:rPr>
-          <w:i/>
-        </w:rPr>
-        <w:t>Hình 5: Map với PI: RMS e_T và TV theo ca</w:t>
-      </w:r>
-    </w:p>
-    <w:p>
-      <w:pPr>
-        <w:jc w:val="center"/>
-      </w:pPr>
-      <w:r>
-        <w:drawing>
-          <wp:inline xmlns:a="http://schemas.openxmlformats.org/drawingml/2006/main" xmlns:pic="http://schemas.openxmlformats.org/drawingml/2006/picture">
-            <wp:extent cx="5040000" cy="4022630"/>
-            <wp:docPr id="6" name="Picture 6"/>
-            <wp:cNvGraphicFramePr>
-              <a:graphicFrameLocks noChangeAspect="1"/>
-            </wp:cNvGraphicFramePr>
-            <a:graphic>
-              <a:graphicData uri="http://schemas.openxmlformats.org/drawingml/2006/picture">
-                <pic:pic>
-                  <pic:nvPicPr>
-                    <pic:cNvPr id="0" name="Map_vs_PI_TC3_mu_drop_hard_corner_Ts_eT_Ta.png"/>
-                    <pic:cNvPicPr/>
-                  </pic:nvPicPr>
-                  <pic:blipFill>
-                    <a:blip r:embed="rId14"/>
-                    <a:stretch>
-                      <a:fillRect/>
-                    </a:stretch>
-                  </pic:blipFill>
-                  <pic:spPr>
-                    <a:xfrm>
-                      <a:off x="0" y="0"/>
-                      <a:ext cx="5040000" cy="4022630"/>
-                    </a:xfrm>
-                    <a:prstGeom prst="rect"/>
-                  </pic:spPr>
-                </pic:pic>
-              </a:graphicData>
-            </a:graphic>
-          </wp:inline>
-        </w:drawing>
-      </w:r>
-    </w:p>
-    <w:p>
-      <w:pPr>
-        <w:jc w:val="center"/>
-      </w:pPr>
-      <w:r>
-        <w:rPr>
-          <w:i/>
-        </w:rPr>
-        <w:t>Hình 6: TC3 (mu giảm trong cua gắt): T_s, e_T, T_a</w:t>
-      </w:r>
-    </w:p>
-    <w:p>
-      <w:pPr>
-        <w:jc w:val="center"/>
-      </w:pPr>
-      <w:r>
-        <w:drawing>
-          <wp:inline xmlns:a="http://schemas.openxmlformats.org/drawingml/2006/main" xmlns:pic="http://schemas.openxmlformats.org/drawingml/2006/picture">
-            <wp:extent cx="5040000" cy="4022630"/>
-            <wp:docPr id="7" name="Picture 7"/>
-            <wp:cNvGraphicFramePr>
-              <a:graphicFrameLocks noChangeAspect="1"/>
-            </wp:cNvGraphicFramePr>
-            <a:graphic>
-              <a:graphicData uri="http://schemas.openxmlformats.org/drawingml/2006/picture">
-                <pic:pic>
-                  <pic:nvPicPr>
-                    <pic:cNvPr id="0" name="Map_vs_PI_TC4_wet_patch_lane_change_Ts_eT_Ta.png"/>
-                    <pic:cNvPicPr/>
-                  </pic:nvPicPr>
-                  <pic:blipFill>
-                    <a:blip r:embed="rId15"/>
-                    <a:stretch>
-                      <a:fillRect/>
-                    </a:stretch>
-                  </pic:blipFill>
-                  <pic:spPr>
-                    <a:xfrm>
-                      <a:off x="0" y="0"/>
-                      <a:ext cx="5040000" cy="4022630"/>
-                    </a:xfrm>
-                    <a:prstGeom prst="rect"/>
-                  </pic:spPr>
-                </pic:pic>
-              </a:graphicData>
-            </a:graphic>
-          </wp:inline>
-        </w:drawing>
-      </w:r>
-    </w:p>
-    <w:p>
-      <w:pPr>
-        <w:jc w:val="center"/>
-      </w:pPr>
-      <w:r>
-        <w:rPr>
-          <w:i/>
-        </w:rPr>
-        <w:t>Hình 7: TC4 (vũng ướt, đổi làn): T_s, e_T, T_a</w:t>
-      </w:r>
-    </w:p>
-    <w:p>
-      <w:r>
-        <w:rPr>
-          <w:i/>
-        </w:rPr>
-        <w:t>Bảng 3: TC3: sai số trung bình e_T theo % của T_d,ref theo cửa sổ (âm = trợ lực thừa)</w:t>
-      </w:r>
-    </w:p>
-    <w:tbl>
-      <w:tblPr>
-        <w:tblStyle w:val="TableGrid"/>
-        <w:tblW w:type="auto" w:w="0"/>
-        <w:tblLook w:firstColumn="1" w:firstRow="1" w:lastColumn="0" w:lastRow="0" w:noHBand="0" w:noVBand="1" w:val="04A0"/>
-      </w:tblPr>
-      <w:tblGrid>
-        <w:gridCol w:w="3135"/>
-        <w:gridCol w:w="3135"/>
-        <w:gridCol w:w="3135"/>
-      </w:tblGrid>
-      <w:tr>
-        <w:tc>
-          <w:tcPr>
-            <w:tcW w:type="dxa" w:w="3135"/>
-          </w:tcPr>
-          <w:p>
-            <w:r>
-              <w:rPr>
-                <w:b/>
-                <w:sz w:val="20"/>
-              </w:rPr>
-              <w:t>Cửa sổ</w:t>
-            </w:r>
-          </w:p>
-        </w:tc>
-        <w:tc>
-          <w:tcPr>
-            <w:tcW w:type="dxa" w:w="3135"/>
-          </w:tcPr>
-          <w:p>
-            <w:r>
-              <w:rPr>
-                <w:b/>
-                <w:sz w:val="20"/>
-              </w:rPr>
-              <w:t>Map</w:t>
-            </w:r>
-          </w:p>
-        </w:tc>
-        <w:tc>
-          <w:tcPr>
-            <w:tcW w:type="dxa" w:w="3135"/>
-          </w:tcPr>
-          <w:p>
-            <w:r>
-              <w:rPr>
-                <w:b/>
-                <w:sz w:val="20"/>
-              </w:rPr>
-              <w:t>PI</w:t>
-            </w:r>
-          </w:p>
-        </w:tc>
-      </w:tr>
-      <w:tr>
-        <w:tc>
-          <w:tcPr>
-            <w:tcW w:type="dxa" w:w="3135"/>
-          </w:tcPr>
-          <w:p>
-            <w:r>
-              <w:rPr>
-                <w:sz w:val="20"/>
-              </w:rPr>
-              <w:t>after_mu_drop_steady</w:t>
-            </w:r>
-          </w:p>
-        </w:tc>
-        <w:tc>
-          <w:tcPr>
-            <w:tcW w:type="dxa" w:w="3135"/>
-          </w:tcPr>
-          <w:p>
-            <w:r>
-              <w:rPr>
-                <w:sz w:val="20"/>
-              </w:rPr>
-              <w:t>-14.1</w:t>
-            </w:r>
-          </w:p>
-        </w:tc>
-        <w:tc>
-          <w:tcPr>
-            <w:tcW w:type="dxa" w:w="3135"/>
-          </w:tcPr>
-          <w:p>
-            <w:r>
-              <w:rPr>
-                <w:sz w:val="20"/>
-              </w:rPr>
-              <w:t>-0.0718</w:t>
-            </w:r>
-          </w:p>
-        </w:tc>
-      </w:tr>
-      <w:tr>
-        <w:tc>
-          <w:tcPr>
-            <w:tcW w:type="dxa" w:w="3135"/>
-          </w:tcPr>
-          <w:p>
-            <w:r>
-              <w:rPr>
-                <w:sz w:val="20"/>
-              </w:rPr>
-              <w:t>before_mu_drop</w:t>
-            </w:r>
-          </w:p>
-        </w:tc>
-        <w:tc>
-          <w:tcPr>
-            <w:tcW w:type="dxa" w:w="3135"/>
-          </w:tcPr>
-          <w:p>
-            <w:r>
-              <w:rPr>
-                <w:sz w:val="20"/>
-              </w:rPr>
-              <w:t>17.3</w:t>
-            </w:r>
-          </w:p>
-        </w:tc>
-        <w:tc>
-          <w:tcPr>
-            <w:tcW w:type="dxa" w:w="3135"/>
-          </w:tcPr>
-          <w:p>
-            <w:r>
-              <w:rPr>
-                <w:sz w:val="20"/>
-              </w:rPr>
-              <w:t>-1.17</w:t>
-            </w:r>
-          </w:p>
-        </w:tc>
-      </w:tr>
-    </w:tbl>
-    <w:p/>
-    <w:p>
-      <w:r>
-        <w:rPr>
-          <w:i/>
-        </w:rPr>
-        <w:t>Bảng 4: TC4: sai số trung bình e_T theo % của T_d,ref trong vũng nước (âm = trợ lực thừa)</w:t>
-      </w:r>
-    </w:p>
-    <w:tbl>
-      <w:tblPr>
-        <w:tblStyle w:val="TableGrid"/>
-        <w:tblW w:type="auto" w:w="0"/>
-        <w:tblLook w:firstColumn="1" w:firstRow="1" w:lastColumn="0" w:lastRow="0" w:noHBand="0" w:noVBand="1" w:val="04A0"/>
-      </w:tblPr>
-      <w:tblGrid>
-        <w:gridCol w:w="3135"/>
-        <w:gridCol w:w="3135"/>
-        <w:gridCol w:w="3135"/>
-      </w:tblGrid>
-      <w:tr>
-        <w:tc>
-          <w:tcPr>
-            <w:tcW w:type="dxa" w:w="3135"/>
-          </w:tcPr>
-          <w:p>
-            <w:r>
-              <w:rPr>
-                <w:b/>
-                <w:sz w:val="20"/>
-              </w:rPr>
-              <w:t>Cửa sổ</w:t>
-            </w:r>
-          </w:p>
-        </w:tc>
-        <w:tc>
-          <w:tcPr>
-            <w:tcW w:type="dxa" w:w="3135"/>
-          </w:tcPr>
-          <w:p>
-            <w:r>
-              <w:rPr>
-                <w:b/>
-                <w:sz w:val="20"/>
-              </w:rPr>
-              <w:t>Map</w:t>
-            </w:r>
-          </w:p>
-        </w:tc>
-        <w:tc>
-          <w:tcPr>
-            <w:tcW w:type="dxa" w:w="3135"/>
-          </w:tcPr>
-          <w:p>
-            <w:r>
-              <w:rPr>
-                <w:b/>
-                <w:sz w:val="20"/>
-              </w:rPr>
-              <w:t>PI</w:t>
-            </w:r>
-          </w:p>
-        </w:tc>
-      </w:tr>
-      <w:tr>
-        <w:tc>
-          <w:tcPr>
-            <w:tcW w:type="dxa" w:w="3135"/>
-          </w:tcPr>
-          <w:p>
-            <w:r>
-              <w:rPr>
-                <w:sz w:val="20"/>
-              </w:rPr>
-              <w:t>during_puddle</w:t>
-            </w:r>
-          </w:p>
-        </w:tc>
-        <w:tc>
-          <w:tcPr>
-            <w:tcW w:type="dxa" w:w="3135"/>
-          </w:tcPr>
-          <w:p>
-            <w:r>
-              <w:rPr>
-                <w:sz w:val="20"/>
-              </w:rPr>
-              <w:t>-83.5</w:t>
-            </w:r>
-          </w:p>
-        </w:tc>
-        <w:tc>
-          <w:tcPr>
-            <w:tcW w:type="dxa" w:w="3135"/>
-          </w:tcPr>
-          <w:p>
-            <w:r>
-              <w:rPr>
-                <w:sz w:val="20"/>
-              </w:rPr>
-              <w:t>-56.4</w:t>
-            </w:r>
-          </w:p>
-        </w:tc>
-      </w:tr>
-    </w:tbl>
-    <w:p/>
-    <w:p>
-      <w:r>
-        <w:t>Nhận xét hiện có: PI bám tốt hơn và êm hơn Map ở 5 trên 6 ca. Chưa là kết luận cuối: chưa so mặt Pareto chung, chưa có PID, e_rel của Map trên ca TK là 57.1 % (vượt ngưỡng 3 %).</w:t>
+        <w:t>[Chưa có] Pareto chung Map, PI, PID cùng trục và so sánh seed 99999: chưa chạy lại sau khi Map đổi sang lead-lag; số liệu Result/Compare/Map_vs_* cũ không dùng.</w:t>
       </w:r>
     </w:p>
     <w:p>

</xml_diff>